<commit_message>
feat: Implement evaluation timeline and working days calculation according to KKU regulations
feat: Implement evaluation timeline and working days calculation according to KKU regulations

- Added EvaluationTimeline class to manage deadlines for teaching evaluation based on KKU announcements 1669/2569 and 1670/2569.
- Introduced WorkingDays utility to calculate working days excluding weekends.
- Created SQL migration scripts to add new date fields for position requests in the database.
- Developed comprehensive unit tests for EvaluationTimeline and WorkingDays functionalities.
- Updated documentation to reflect changes in the system according to the new regulations.
</commit_message>
<xml_diff>
--- a/HRCP-KKU-Academic/src/main/resources/templates/docx/Phase2/p2doc_3.docx
+++ b/HRCP-KKU-Academic/src/main/resources/templates/docx/Phase2/p2doc_3.docx
@@ -157,84 +157,7 @@
           <w:szCs w:val="30"/>
           <w:cs/>
         </w:rPr>
-        <w:t>ตามที่ประกาศ ก.พ.อ.</w:t>
-      </w:r>
-      <w:r>
-        <w:rPr>
-          <w:rFonts w:ascii="TH Sarabun New" w:hAnsi="TH Sarabun New" w:cs="TH Sarabun New" w:hint="cs"/>
-          <w:b/>
-          <w:bCs/>
-          <w:sz w:val="30"/>
-          <w:szCs w:val="30"/>
-          <w:cs/>
-        </w:rPr>
-        <w:t xml:space="preserve"> / </w:t>
-      </w:r>
-      <w:r>
-        <w:rPr>
-          <w:rFonts w:ascii="TH Sarabun New" w:hAnsi="TH Sarabun New" w:cs="TH Sarabun New"/>
-          <w:b/>
-          <w:bCs/>
-          <w:sz w:val="30"/>
-          <w:szCs w:val="30"/>
-          <w:cs/>
-        </w:rPr>
-        <w:t>ข้อบังคับมหาวิทยาลัยขอนแก่นว่าด้วยคุณสมบัติ หลักเกณฑ์และวิธีการแต่งตั้ง</w:t>
-      </w:r>
-      <w:r>
-        <w:rPr>
-          <w:rFonts w:ascii="TH Sarabun New" w:hAnsi="TH Sarabun New" w:cs="TH Sarabun New" w:hint="cs"/>
-          <w:b/>
-          <w:bCs/>
-          <w:sz w:val="30"/>
-          <w:szCs w:val="30"/>
-          <w:cs/>
-        </w:rPr>
-        <w:t xml:space="preserve">             </w:t>
-      </w:r>
-      <w:r>
-        <w:rPr>
-          <w:rFonts w:ascii="TH Sarabun New" w:hAnsi="TH Sarabun New" w:cs="TH Sarabun New"/>
-          <w:b/>
-          <w:bCs/>
-          <w:sz w:val="30"/>
-          <w:szCs w:val="30"/>
-          <w:cs/>
-        </w:rPr>
-        <w:t xml:space="preserve">และถอดถอนผู้ดำรงตำแหน่งทางวิชาการ สำหรับข้าราชการพลเรือนในสถาบันอุดมศึกษา และพนักงานมหาวิทยาลัย </w:t>
-      </w:r>
-      <w:r>
-        <w:rPr>
-          <w:rFonts w:ascii="TH Sarabun New" w:hAnsi="TH Sarabun New" w:cs="TH Sarabun New" w:hint="cs"/>
-          <w:b/>
-          <w:bCs/>
-          <w:sz w:val="30"/>
-          <w:szCs w:val="30"/>
-          <w:cs/>
-        </w:rPr>
-        <w:t xml:space="preserve">            </w:t>
-      </w:r>
-      <w:r>
-        <w:rPr>
-          <w:rFonts w:ascii="TH Sarabun New" w:hAnsi="TH Sarabun New" w:cs="TH Sarabun New"/>
-          <w:b/>
-          <w:bCs/>
-          <w:sz w:val="30"/>
-          <w:szCs w:val="30"/>
-          <w:cs/>
-        </w:rPr>
-        <w:t>พ.ศ. 256</w:t>
-      </w:r>
-      <w:r>
-        <w:rPr>
-          <w:rFonts w:ascii="TH Sarabun New" w:hAnsi="TH Sarabun New" w:cs="TH Sarabun New" w:hint="cs"/>
-          <w:b/>
-          <w:bCs/>
-          <w:sz w:val="30"/>
-          <w:szCs w:val="30"/>
-          <w:cs/>
-        </w:rPr>
-        <w:t>5</w:t>
+        <w:t xml:space="preserve">ตามที่ประกาศ ก.พ.อ. / ข้อบังคับมหาวิทยาลัยขอนแก่นว่าด้วยคุณสมบัติ หลักเกณฑ์และวิธีการแต่งตั้งและถอดถอนผู้ดำรงตำแหน่งทางวิชาการ สำหรับข้าราชการพลเรือนในสถาบันอุดมศึกษา พ.ศ. 2565 และข้อบังคับฯ ฉบับสำหรับพนักงานมหาวิทยาลัยขอนแก่น พ.ศ. 2569</w:t>
       </w:r>
       <w:r>
         <w:rPr>
@@ -264,27 +187,7 @@
           <w:cs/>
         </w:rPr>
         <w:tab/>
-        <w:t xml:space="preserve">1) ต้องมีความซื่อสัตย์ทางวิชาการ ไม่นำผลงานของผู้อื่นมาเป็นผลงานของตนและไม่ลอกเลียนผลงานของผู้อื่น </w:t>
-      </w:r>
-      <w:r>
-        <w:rPr>
-          <w:rFonts w:ascii="TH Sarabun New" w:hAnsi="TH Sarabun New" w:cs="TH Sarabun New"/>
-          <w:sz w:val="30"/>
-          <w:szCs w:val="30"/>
-          <w:cs/>
-        </w:rPr>
-        <w:br/>
-        <w:t xml:space="preserve">ไม่นำผลงานของตนเองในเรื่องเดียวกันไปเผยแพร่ในวารสารวิชาการมากกว่าหนึ่งฉบับ รวมถึงไม่คัดลอกข้อความใด ๆ </w:t>
-      </w:r>
-      <w:r>
-        <w:rPr>
-          <w:rFonts w:ascii="TH Sarabun New" w:hAnsi="TH Sarabun New" w:cs="TH Sarabun New"/>
-          <w:sz w:val="30"/>
-          <w:szCs w:val="30"/>
-          <w:cs/>
-        </w:rPr>
-        <w:br/>
-        <w:t>จากผลงานเดิมของตน โดยไม่อ้างอิงผลงานเดิมตามหลักวิชาการ ทั้งนี้ ในลักษณะที่จะทำให้เข้าใจผิดว่าเป็นผลงานใหม่</w:t>
+        <w:t xml:space="preserve">1) ต้องมีความซื่อสัตย์ทางวิชาการ ไม่นำผลงานของผู้อื่นมาเป็นผลงานของตน ไม่ลอกเลียนผลงานของผู้อื่น ไม่สร้างข้อมูลหรือข้อเท็จจริงอันไม่มีอยู่จริง (fabrication) ไม่บิดเบือนข้อมูลหรือข้อเท็จจริง (falsification) ไม่นำผลงานของตนเองในเรื่องเดียวกันไปเผยแพร่ในวารสารวิชาการมากกว่าหนึ่งฉบับ ในลักษณะที่จะทำให้เข้าใจผิดว่าเป็นผลงานใหม่ รวมถึงไม่คัดลอกข้อความใด ๆ จากผลงานเดิมของตน โดยไม่อ้างอิงผลงานเดิมตามหลักวิชาการ</w:t>
       </w:r>
     </w:p>
     <w:p>
@@ -389,25 +292,28 @@
           <w:cs/>
         </w:rPr>
         <w:tab/>
-        <w:t xml:space="preserve">6) หากผลงานทางวิชาการมีการใช้ข้อมูลจากการทำการวิจัยในคนหรือสัตว์ ผู้ขอตำแหน่งจะต้องยื่นหลักฐานที่แสดงว่าการทำวิจัยดังกล่าวสอดคล้องกับประกาศหลักเกณฑ์ของคณะกรรมการจริยธรรมการวิจัยของมหาวิทยาลัย </w:t>
-      </w:r>
-      <w:r>
-        <w:rPr>
-          <w:rFonts w:ascii="TH Sarabun New" w:hAnsi="TH Sarabun New" w:cs="TH Sarabun New" w:hint="cs"/>
-          <w:sz w:val="30"/>
-          <w:szCs w:val="30"/>
-          <w:cs/>
-        </w:rPr>
-        <w:t xml:space="preserve">              </w:t>
-      </w:r>
-      <w:r>
-        <w:rPr>
-          <w:rFonts w:ascii="TH Sarabun New" w:hAnsi="TH Sarabun New" w:cs="TH Sarabun New"/>
-          <w:sz w:val="30"/>
-          <w:szCs w:val="30"/>
-          <w:cs/>
-        </w:rPr>
-        <w:t>หรือหน่วยงานที่เกี่ยวข้อง</w:t>
+        <w:t xml:space="preserve">6) หากผลงานทางวิชาการมีการใช้ข้อมูลจากการทำการวิจัยในคนหรือสัตว์ ผู้ขอกำหนดตำแหน่งทางวิชาการจะต้องยื่นหลักฐานแสดงการอนุญาตจากคณะกรรมการจริยธรรมการวิจัยของสถาบันที่มีการดำเนินการ</w:t>
+      </w:r>
+    </w:p>
+    <w:p>
+      <w:pPr>
+        <w:spacing w:after="0" w:line="240" w:lineRule="auto"/>
+        <w:jc w:val="thaiDistribute"/>
+        <w:rPr>
+          <w:rFonts w:ascii="TH Sarabun New" w:hAnsi="TH Sarabun New" w:cs="TH Sarabun New"/>
+          <w:sz w:val="30"/>
+          <w:szCs w:val="30"/>
+        </w:rPr>
+      </w:pPr>
+      <w:r>
+        <w:rPr>
+          <w:rFonts w:ascii="TH Sarabun New" w:hAnsi="TH Sarabun New" w:cs="TH Sarabun New"/>
+          <w:sz w:val="30"/>
+          <w:szCs w:val="30"/>
+          <w:cs/>
+        </w:rPr>
+        <w:tab/>
+        <w:t xml:space="preserve">7) ต้องไม่กระทำผิดจริยธรรมทั่วไปอย่างร้ายแรง หรือทุจริตต่อหน้าที่ ถูกไล่ออกหรือปลดออกจากตำแหน่งเพราะกระทำผิดวินัยร้ายแรง หรือกระทำผิดอื่นอันเป็นการเสื่อมเสียต่อเกียรติศักดิ์ของการดำรงตำแหน่งทางวิชาการ</w:t>
       </w:r>
     </w:p>
     <w:p>

</xml_diff>

<commit_message>
Add doc 7 auto-fill and long-term PDF signing
This change adds auto-filled document 7 fields from applicant data while locking system-derived values and exposes the new revision flow for staff. It also updates request/progress UI to show folded work copies and revision states. On the signature side, it adds TSA timestamping and long-term validation data (PAdES LT/DSS) to signed PDFs, and includes backfills and new tests for doc 7, revision status, and signature validation.
</commit_message>
<xml_diff>
--- a/HRCP-KKU-Academic/src/main/resources/templates/docx/Phase2/p2doc_3.docx
+++ b/HRCP-KKU-Academic/src/main/resources/templates/docx/Phase2/p2doc_3.docx
@@ -157,7 +157,7 @@
           <w:szCs w:val="30"/>
           <w:cs/>
         </w:rPr>
-        <w:t xml:space="preserve">ตามที่ประกาศ ก.พ.อ. / ข้อบังคับมหาวิทยาลัยขอนแก่นว่าด้วยคุณสมบัติ หลักเกณฑ์และวิธีการแต่งตั้งและถอดถอนผู้ดำรงตำแหน่งทางวิชาการ สำหรับข้าราชการพลเรือนในสถาบันอุดมศึกษา พ.ศ. 2565 และข้อบังคับฯ ฉบับสำหรับพนักงานมหาวิทยาลัยขอนแก่น พ.ศ. 2569</w:t>
+        <w:t>ตามที่ประกาศ ก.พ.อ. / ข้อบังคับมหาวิทยาลัยขอนแก่นว่าด้วยคุณสมบัติ หลักเกณฑ์และวิธีการแต่งตั้งและถอดถอนผู้ดำรงตำแหน่งทางวิชาการ สำหรับข้าราชการพลเรือนในสถาบันอุดมศึกษา พ.ศ. 2565 และข้อบังคับฯ ฉบับสำหรับพนักงานมหาวิทยาลัยขอนแก่น พ.ศ. 2569</w:t>
       </w:r>
       <w:r>
         <w:rPr>
@@ -187,7 +187,7 @@
           <w:cs/>
         </w:rPr>
         <w:tab/>
-        <w:t xml:space="preserve">1) ต้องมีความซื่อสัตย์ทางวิชาการ ไม่นำผลงานของผู้อื่นมาเป็นผลงานของตน ไม่ลอกเลียนผลงานของผู้อื่น ไม่สร้างข้อมูลหรือข้อเท็จจริงอันไม่มีอยู่จริง (fabrication) ไม่บิดเบือนข้อมูลหรือข้อเท็จจริง (falsification) ไม่นำผลงานของตนเองในเรื่องเดียวกันไปเผยแพร่ในวารสารวิชาการมากกว่าหนึ่งฉบับ ในลักษณะที่จะทำให้เข้าใจผิดว่าเป็นผลงานใหม่ รวมถึงไม่คัดลอกข้อความใด ๆ จากผลงานเดิมของตน โดยไม่อ้างอิงผลงานเดิมตามหลักวิชาการ</w:t>
+        <w:t>1) ต้องมีความซื่อสัตย์ทางวิชาการ ไม่นำผลงานของผู้อื่นมาเป็นผลงานของตน ไม่ลอกเลียนผลงานของผู้อื่น ไม่สร้างข้อมูลหรือข้อเท็จจริงอันไม่มีอยู่จริง (fabrication) ไม่บิดเบือนข้อมูลหรือข้อเท็จจริง (falsification) ไม่นำผลงานของตนเองในเรื่องเดียวกันไปเผยแพร่ในวารสารวิชาการมากกว่าหนึ่งฉบับ ในลักษณะที่จะทำให้เข้าใจผิดว่าเป็นผลงานใหม่ รวมถึงไม่คัดลอกข้อความใด ๆ จากผลงานเดิมของตน โดยไม่อ้างอิงผลงานเดิมตามหลักวิชาการ</w:t>
       </w:r>
     </w:p>
     <w:p>
@@ -292,7 +292,7 @@
           <w:cs/>
         </w:rPr>
         <w:tab/>
-        <w:t xml:space="preserve">6) หากผลงานทางวิชาการมีการใช้ข้อมูลจากการทำการวิจัยในคนหรือสัตว์ ผู้ขอกำหนดตำแหน่งทางวิชาการจะต้องยื่นหลักฐานแสดงการอนุญาตจากคณะกรรมการจริยธรรมการวิจัยของสถาบันที่มีการดำเนินการ</w:t>
+        <w:t>6) หากผลงานทางวิชาการมีการใช้ข้อมูลจากการทำการวิจัยในคนหรือสัตว์ ผู้ขอกำหนดตำแหน่งทางวิชาการจะต้องยื่นหลักฐานแสดงการอนุญาตจากคณะกรรมการจริยธรรมการวิจัยของสถาบันที่มีการดำเนินการ</w:t>
       </w:r>
     </w:p>
     <w:p>
@@ -313,7 +313,7 @@
           <w:cs/>
         </w:rPr>
         <w:tab/>
-        <w:t xml:space="preserve">7) ต้องไม่กระทำผิดจริยธรรมทั่วไปอย่างร้ายแรง หรือทุจริตต่อหน้าที่ ถูกไล่ออกหรือปลดออกจากตำแหน่งเพราะกระทำผิดวินัยร้ายแรง หรือกระทำผิดอื่นอันเป็นการเสื่อมเสียต่อเกียรติศักดิ์ของการดำรงตำแหน่งทางวิชาการ</w:t>
+        <w:t>7) ต้องไม่กระทำผิดจริยธรรมทั่วไปอย่างร้ายแรง หรือทุจริตต่อหน้าที่ ถูกไล่ออกหรือปลดออกจากตำแหน่งเพราะกระทำผิดวินัยร้ายแรง หรือกระทำผิดอื่นอันเป็นการเสื่อมเสียต่อเกียรติศักดิ์ของการดำรงตำแหน่งทางวิชาการ</w:t>
       </w:r>
     </w:p>
     <w:p>
@@ -423,7 +423,25 @@
           <w:sz w:val="30"/>
           <w:szCs w:val="30"/>
         </w:rPr>
-        <w:t>{{title}}{{applicant_name}}</w:t>
+        <w:t>{{title}}{{</w:t>
+      </w:r>
+      <w:proofErr w:type="spellStart"/>
+      <w:r>
+        <w:rPr>
+          <w:rFonts w:ascii="TH Sarabun New" w:hAnsi="TH Sarabun New" w:cs="TH Sarabun New"/>
+          <w:sz w:val="30"/>
+          <w:szCs w:val="30"/>
+        </w:rPr>
+        <w:t>applicant_name</w:t>
+      </w:r>
+      <w:proofErr w:type="spellEnd"/>
+      <w:r>
+        <w:rPr>
+          <w:rFonts w:ascii="TH Sarabun New" w:hAnsi="TH Sarabun New" w:cs="TH Sarabun New"/>
+          <w:sz w:val="30"/>
+          <w:szCs w:val="30"/>
+        </w:rPr>
+        <w:t>}}</w:t>
       </w:r>
       <w:r>
         <w:rPr>
@@ -460,18 +478,37 @@
           <w:sz w:val="30"/>
           <w:szCs w:val="30"/>
         </w:rPr>
-        <w:t>{{certification_date}}</w:t>
-      </w:r>
-    </w:p>
-    <w:p>
-      <w:pPr>
-        <w:spacing w:after="0" w:line="240" w:lineRule="auto"/>
+        <w:t>{{</w:t>
+      </w:r>
+      <w:proofErr w:type="spellStart"/>
+      <w:r>
+        <w:rPr>
+          <w:rFonts w:ascii="TH Sarabun New" w:hAnsi="TH Sarabun New" w:cs="TH Sarabun New"/>
+          <w:sz w:val="30"/>
+          <w:szCs w:val="30"/>
+        </w:rPr>
+        <w:t>certification_date</w:t>
+      </w:r>
+      <w:proofErr w:type="spellEnd"/>
+      <w:r>
+        <w:rPr>
+          <w:rFonts w:ascii="TH Sarabun New" w:hAnsi="TH Sarabun New" w:cs="TH Sarabun New"/>
+          <w:sz w:val="30"/>
+          <w:szCs w:val="30"/>
+        </w:rPr>
+        <w:t>}}</w:t>
+      </w:r>
+    </w:p>
+    <w:p>
+      <w:pPr>
         <w:rPr>
           <w:rFonts w:ascii="TH Sarabun New" w:hAnsi="TH Sarabun New" w:cs="TH Sarabun New"/>
           <w:b/>
           <w:bCs/>
           <w:sz w:val="30"/>
           <w:szCs w:val="30"/>
+          <w:u w:val="single"/>
+          <w:cs/>
         </w:rPr>
       </w:pPr>
       <w:r>
@@ -484,15 +521,40 @@
           <w:u w:val="single"/>
           <w:cs/>
         </w:rPr>
-        <w:t>ตอนที่ 2</w:t>
-      </w:r>
-      <w:r>
+        <w:br w:type="page"/>
+      </w:r>
+    </w:p>
+    <w:p>
+      <w:pPr>
+        <w:spacing w:after="0" w:line="240" w:lineRule="auto"/>
         <w:rPr>
           <w:rFonts w:ascii="TH Sarabun New" w:hAnsi="TH Sarabun New" w:cs="TH Sarabun New"/>
           <w:b/>
           <w:bCs/>
           <w:sz w:val="30"/>
           <w:szCs w:val="30"/>
+        </w:rPr>
+      </w:pPr>
+      <w:r>
+        <w:rPr>
+          <w:rFonts w:ascii="TH Sarabun New" w:hAnsi="TH Sarabun New" w:cs="TH Sarabun New"/>
+          <w:b/>
+          <w:bCs/>
+          <w:sz w:val="30"/>
+          <w:szCs w:val="30"/>
+          <w:u w:val="single"/>
+          <w:cs/>
+        </w:rPr>
+        <w:lastRenderedPageBreak/>
+        <w:t>ตอนที่ 2</w:t>
+      </w:r>
+      <w:r>
+        <w:rPr>
+          <w:rFonts w:ascii="TH Sarabun New" w:hAnsi="TH Sarabun New" w:cs="TH Sarabun New"/>
+          <w:b/>
+          <w:bCs/>
+          <w:sz w:val="30"/>
+          <w:szCs w:val="30"/>
           <w:cs/>
         </w:rPr>
         <w:t xml:space="preserve">   สำหรับ คณะ/หน่วยงาน</w:t>
@@ -578,7 +640,25 @@
           <w:sz w:val="30"/>
           <w:szCs w:val="30"/>
         </w:rPr>
-        <w:t>{{dean_name}}</w:t>
+        <w:t>{{</w:t>
+      </w:r>
+      <w:proofErr w:type="spellStart"/>
+      <w:r>
+        <w:rPr>
+          <w:rFonts w:ascii="TH Sarabun New" w:hAnsi="TH Sarabun New" w:cs="TH Sarabun New"/>
+          <w:sz w:val="30"/>
+          <w:szCs w:val="30"/>
+        </w:rPr>
+        <w:t>dean_name</w:t>
+      </w:r>
+      <w:proofErr w:type="spellEnd"/>
+      <w:r>
+        <w:rPr>
+          <w:rFonts w:ascii="TH Sarabun New" w:hAnsi="TH Sarabun New" w:cs="TH Sarabun New"/>
+          <w:sz w:val="30"/>
+          <w:szCs w:val="30"/>
+        </w:rPr>
+        <w:t>}}</w:t>
       </w:r>
       <w:r>
         <w:rPr>
@@ -606,7 +686,25 @@
           <w:sz w:val="30"/>
           <w:szCs w:val="30"/>
         </w:rPr>
-        <w:t>{{dean_position}}</w:t>
+        <w:t>{{</w:t>
+      </w:r>
+      <w:proofErr w:type="spellStart"/>
+      <w:r>
+        <w:rPr>
+          <w:rFonts w:ascii="TH Sarabun New" w:hAnsi="TH Sarabun New" w:cs="TH Sarabun New"/>
+          <w:sz w:val="30"/>
+          <w:szCs w:val="30"/>
+        </w:rPr>
+        <w:t>dean_position</w:t>
+      </w:r>
+      <w:proofErr w:type="spellEnd"/>
+      <w:r>
+        <w:rPr>
+          <w:rFonts w:ascii="TH Sarabun New" w:hAnsi="TH Sarabun New" w:cs="TH Sarabun New"/>
+          <w:sz w:val="30"/>
+          <w:szCs w:val="30"/>
+        </w:rPr>
+        <w:t>}}</w:t>
       </w:r>
     </w:p>
     <w:p>
@@ -634,7 +732,25 @@
           <w:sz w:val="30"/>
           <w:szCs w:val="30"/>
         </w:rPr>
-        <w:t>{{verify_date}}</w:t>
+        <w:t>{{</w:t>
+      </w:r>
+      <w:proofErr w:type="spellStart"/>
+      <w:r>
+        <w:rPr>
+          <w:rFonts w:ascii="TH Sarabun New" w:hAnsi="TH Sarabun New" w:cs="TH Sarabun New"/>
+          <w:sz w:val="30"/>
+          <w:szCs w:val="30"/>
+        </w:rPr>
+        <w:t>verify_date</w:t>
+      </w:r>
+      <w:proofErr w:type="spellEnd"/>
+      <w:r>
+        <w:rPr>
+          <w:rFonts w:ascii="TH Sarabun New" w:hAnsi="TH Sarabun New" w:cs="TH Sarabun New"/>
+          <w:sz w:val="30"/>
+          <w:szCs w:val="30"/>
+        </w:rPr>
+        <w:t>}}</w:t>
       </w:r>
     </w:p>
     <w:sectPr>
@@ -702,7 +818,7 @@
 <w:hdr xmlns:wpc="http://schemas.microsoft.com/office/word/2010/wordprocessingCanvas" xmlns:cx="http://schemas.microsoft.com/office/drawing/2014/chartex" xmlns:cx1="http://schemas.microsoft.com/office/drawing/2015/9/8/chartex" xmlns:cx2="http://schemas.microsoft.com/office/drawing/2015/10/21/chartex" xmlns:cx3="http://schemas.microsoft.com/office/drawing/2016/5/9/chartex" xmlns:cx4="http://schemas.microsoft.com/office/drawing/2016/5/10/chartex" xmlns:cx5="http://schemas.microsoft.com/office/drawing/2016/5/11/chartex" xmlns:cx6="http://schemas.microsoft.com/office/drawing/2016/5/12/chartex" xmlns:cx7="http://schemas.microsoft.com/office/drawing/2016/5/13/chartex" xmlns:cx8="http://schemas.microsoft.com/office/drawing/2016/5/14/chartex" xmlns:mc="http://schemas.openxmlformats.org/markup-compatibility/2006" xmlns:aink="http://schemas.microsoft.com/office/drawing/2016/ink" xmlns:am3d="http://schemas.microsoft.com/office/drawing/2017/model3d" xmlns:o="urn:schemas-microsoft-com:office:office" xmlns:oel="http://schemas.microsoft.com/office/2019/extlst" xmlns:r="http://schemas.openxmlformats.org/officeDocument/2006/relationships" xmlns:m="http://schemas.openxmlformats.org/officeDocument/2006/math" xmlns:v="urn:schemas-microsoft-com:vml" xmlns:wp14="http://schemas.microsoft.com/office/word/2010/wordprocessingDrawing" xmlns:wp="http://schemas.openxmlformats.org/drawingml/2006/wordprocessingDrawing" xmlns:w10="urn:schemas-microsoft-com:office:word" xmlns:w="http://schemas.openxmlformats.org/wordprocessingml/2006/main" xmlns:w14="http://schemas.microsoft.com/office/word/2010/wordml" xmlns:w15="http://schemas.microsoft.com/office/word/2012/wordml" xmlns:w16cex="http://schemas.microsoft.com/office/word/2018/wordml/cex" xmlns:w16cid="http://schemas.microsoft.com/office/word/2016/wordml/cid" xmlns:w16="http://schemas.microsoft.com/office/word/2018/wordml" xmlns:w16du="http://schemas.microsoft.com/office/word/2023/wordml/word16du" xmlns:w16sdtdh="http://schemas.microsoft.com/office/word/2020/wordml/sdtdatahash" xmlns:w16sdtfl="http://schemas.microsoft.com/office/word/2024/wordml/sdtformatlock" xmlns:w16se="http://schemas.microsoft.com/office/word/2015/wordml/symex" xmlns:wpg="http://schemas.microsoft.com/office/word/2010/wordprocessingGroup" xmlns:wpi="http://schemas.microsoft.com/office/word/2010/wordprocessingInk" xmlns:wne="http://schemas.microsoft.com/office/word/2006/wordml" xmlns:wps="http://schemas.microsoft.com/office/word/2010/wordprocessingShape" mc:Ignorable="w14 w15 w16se w16cid w16 w16cex w16sdtdh w16sdtfl w16du wp14">
   <w:p>
     <w:pPr>
-      <w:pStyle w:val="a3"/>
+      <w:pStyle w:val="Header"/>
       <w:rPr>
         <w:rFonts w:ascii="TH SarabunPSK" w:hAnsi="TH SarabunPSK" w:cs="TH SarabunPSK"/>
         <w:sz w:val="28"/>
@@ -1116,18 +1232,18 @@
     <w:lsdException w:name="Unresolved Mention" w:semiHidden="1" w:unhideWhenUsed="1"/>
     <w:lsdException w:name="Smart Link" w:semiHidden="1" w:unhideWhenUsed="1"/>
   </w:latentStyles>
-  <w:style w:type="paragraph" w:default="1" w:styleId="a">
+  <w:style w:type="paragraph" w:default="1" w:styleId="Normal">
     <w:name w:val="Normal"/>
     <w:qFormat/>
     <w:rsid w:val="00857CC1"/>
   </w:style>
-  <w:style w:type="character" w:default="1" w:styleId="a0">
+  <w:style w:type="character" w:default="1" w:styleId="DefaultParagraphFont">
     <w:name w:val="Default Paragraph Font"/>
     <w:uiPriority w:val="1"/>
     <w:semiHidden/>
     <w:unhideWhenUsed/>
   </w:style>
-  <w:style w:type="table" w:default="1" w:styleId="a1">
+  <w:style w:type="table" w:default="1" w:styleId="TableNormal">
     <w:name w:val="Normal Table"/>
     <w:uiPriority w:val="99"/>
     <w:semiHidden/>
@@ -1142,16 +1258,16 @@
       </w:tblCellMar>
     </w:tblPr>
   </w:style>
-  <w:style w:type="numbering" w:default="1" w:styleId="a2">
+  <w:style w:type="numbering" w:default="1" w:styleId="NoList">
     <w:name w:val="No List"/>
     <w:uiPriority w:val="99"/>
     <w:semiHidden/>
     <w:unhideWhenUsed/>
   </w:style>
-  <w:style w:type="paragraph" w:styleId="a3">
+  <w:style w:type="paragraph" w:styleId="Header">
     <w:name w:val="header"/>
-    <w:basedOn w:val="a"/>
-    <w:link w:val="a4"/>
+    <w:basedOn w:val="Normal"/>
+    <w:link w:val="HeaderChar"/>
     <w:uiPriority w:val="99"/>
     <w:unhideWhenUsed/>
     <w:rsid w:val="00857CC1"/>
@@ -1163,10 +1279,10 @@
       <w:spacing w:after="0" w:line="240" w:lineRule="auto"/>
     </w:pPr>
   </w:style>
-  <w:style w:type="character" w:customStyle="1" w:styleId="a4">
-    <w:name w:val="หัวกระดาษ อักขระ"/>
-    <w:basedOn w:val="a0"/>
-    <w:link w:val="a3"/>
+  <w:style w:type="character" w:customStyle="1" w:styleId="HeaderChar">
+    <w:name w:val="Header Char"/>
+    <w:basedOn w:val="DefaultParagraphFont"/>
+    <w:link w:val="Header"/>
     <w:uiPriority w:val="99"/>
     <w:rsid w:val="00857CC1"/>
   </w:style>

</xml_diff>